<commit_message>
Refine kitchen UI with RestaurantIQ patterns and bilingual recipe search
</commit_message>
<xml_diff>
--- a/docs/product/Kitchen MVP Usability Design Report.docx
+++ b/docs/product/Kitchen MVP Usability Design Report.docx
@@ -1584,7 +1584,7 @@
         <w:rPr>
           <w:rtl w:val="0"/>
         </w:rPr>
-        <w:t xml:space="preserve">Use three primary views with clear, contextual actions. Planning, reading instructions and publishing a standard should each feel like a complete task. The following layout is the final design direction for the local demo, and is now implemented in the reviewed local release; effectiveness in actual kitchen work remains unvalidated.</w:t>
+        <w:t>Use three primary views with clear, contextual actions. Planning, reading instructions and publishing a standard should each feel like a complete task. This design direction was implemented in the prior local release; effectiveness in actual kitchen work remains unvalidated.</w:t>
       </w:r>
     </w:p>
     <w:p>
@@ -1829,7 +1829,18 @@
         <w:rPr>
           <w:rtl w:val="0"/>
         </w:rPr>
-        <w:t xml:space="preserve">The navigation, Today flow, week calendar, meal times, controlled portions and focused bilingual Guides editor are implemented. Engineering acceptance:39 backend tests,33 frontend tests, clean lint/build and all8 current laptop/phone workflows (6 main cases plus2 affected guidance reruns). Fresh migration, preservation, actual restart and separate-database restore passed. Customer task comparison remains next.</w:t>
+        <w:t>Prior release engineering acceptance (historical): The earlier local release delivered the navigation, Today flow, week calendar, meal times, controlled portions and focused bilingual Guides editor. Its evidence was 39 backend tests and 33 frontend tests in 9 files, clean lint/build, and eight browser cases reported as six main-run cases plus two corrected guidance cases in a separate 19.3-second run. Fresh migration, preservation, actual restart and separate-database restore passed for that prior release. These counts are historical and are distinct from the current UI refinement acceptance below.</w:t>
+      </w:r>
+    </w:p>
+    <w:p>
+      <w:pPr>
+        <w:rPr/>
+      </w:pPr>
+      <w:r>
+        <w:rPr>
+          <w:rtl w:val="0"/>
+        </w:rPr>
+        <w:t>29 September 2026 follow-on design reuse status. The bounded shell/search refinement and selected-date manager strip are integrated in the local checkout. Plan meals and New Guide support Hindi/English recipe search with selected recipe and portions retained, plus no-match feedback. The manager strip counts selected-date plan entries including unassigned dishes; non-exhausted lots dated before that date; and non-exhausted lots with unknown dates. Lot counts link to More → Stock. Ingredient loading and refresh failures, including post-write refresh, show unavailable rather than zero. Dates prompt review, not a safety verdict. Questions behavior is unchanged. No API, schema, dependency or database changes; 32-recipe data is retained. Sol accepted 39 frontend tests across 10 files, zero-warning lint and a 34-module build; all eight isolated laptop/phone browser workflows passed in 1.6 minutes. Live read-only Playwright confirmed bilingual search, preserved selection/50 portions, no-match, Guides search, 390px Hindi without overflow and zero JS errors. The prior 39 backend tests are reused unchanged because no backend code changed.</w:t>
       </w:r>
     </w:p>
     <w:p>
@@ -2241,24 +2252,7 @@
           <w:vertAlign w:val="baseline"/>
           <w:rtl w:val="0"/>
         </w:rPr>
-        <w:t xml:space="preserve">Report status. </w:t>
-      </w:r>
-      <w:r>
-        <w:rPr>
-          <w:rFonts w:ascii="Helvetica Neue" w:cs="Helvetica Neue" w:eastAsia="Helvetica Neue" w:hAnsi="Helvetica Neue"/>
-          <w:b w:val="0"/>
-          <w:bCs w:val="0"/>
-          <w:i w:val="0"/>
-          <w:iCs w:val="0"/>
-          <w:smallCaps w:val="0"/>
-          <w:strike w:val="0"/>
-          <w:color w:val="000000"/>
-          <w:u w:val="none"/>
-          <w:shd w:fill="auto" w:val="clear"/>
-          <w:vertAlign w:val="baseline"/>
-          <w:rtl w:val="0"/>
-        </w:rPr>
-        <w:t xml:space="preserve">Design direction finalised on 29 September 2026. Application implementation is complete and GitHub-published at source commit4d0962f on MedEvolv/restaurant-inventory-management-system, branch codex/group1-prep-purchase. Customer validation and protected pilot remain open. See CURRENT_RELEASE.md for current delivery status. Core planning and reviewed guidance do not require an LLM API.</w:t>
+        <w:t>Report status. Design direction finalised on 29 September 2026. Source commit 4d0962f is the prior application release. The follow-on shell/search/manager-strip refinement is integrated in the local checkout and engineering-accepted on the existing codex/group1-prep-purchase branch; the latest branch state carries this increment. Customer validation and protected pilot remain open. See CURRENT_RELEASE.md. Core planning and reviewed guidance do not require an LLM API.</w:t>
       </w:r>
     </w:p>
     <w:sectPr>

</xml_diff>